<commit_message>
chore: update portfolio and cv
- Replace downloadable CV with current version
- Mention full working rights and relocation in bio and contact
- Update meta description with current stack
- Add Remote to FoodInn and Shareholder to Aimebee
- Add missing pac-dot cursor asset
- Remove old Vue site in tmp/
</commit_message>
<xml_diff>
--- a/public/vinicius-teixeira-dias-software-engineer.docx
+++ b/public/vinicius-teixeira-dias-software-engineer.docx
@@ -62,7 +62,7 @@
           <w:szCs w:val="18"/>
           <w:rtl w:val="0"/>
         </w:rPr>
-        <w:t xml:space="preserve">viniciustdias2001@gmail.com  |  +61 413 566 833  |  Gold Coast, Australia  |  linkedin.com/in/viniciustxradias  |  github.com/viniciusteixeiradias  |  https://viniciusteixeiradias.github.io/</w:t>
+        <w:t xml:space="preserve">viniciustdias2001@gmail.com  |  +61 413 566 833  |  Gold Coast, QLD (open to relocation)  |  linkedin.com/in/viniciustxradias  |  viniciusteixeiradias.github.io</w:t>
       </w:r>
       <w:r>
         <w:rPr>
@@ -116,7 +116,7 @@
           <w:szCs w:val="19"/>
           <w:rtl w:val="0"/>
         </w:rPr>
-        <w:t xml:space="preserve">Software Engineer with 7+ years of experience designing scalable, multi-tenant distributed systems across startups and enterprise environments. Has owned architecture end-to-end as a founding engineer and sole developer, building high-availability backend platforms with TypeScript, Node.js and PostgreSQL on AWS, and shipping production apps solo from idea to App Store. Track record of cutting CI time, storage and API costs, and eliminating manual processes through automation. Based in Gold Coast, Australia with full work rights, visa sponsorship required.</w:t>
+        <w:t xml:space="preserve">Software Engineer with 7+ years of experience designing scalable, multi-tenant distributed systems across startups and enterprise environments. Has owned architecture end-to-end as a founding engineer and sole developer, building high-availability backend platforms with TypeScript, Node.js and PostgreSQL on AWS, and shipping production apps solo from idea to App Store. Track record of cutting CI time, storage and API costs, and eliminating manual processes through automation. Based in Gold Coast, Australia with full work rights.</w:t>
       </w:r>
     </w:p>
     <w:p>
@@ -181,7 +181,7 @@
           <w:szCs w:val="20"/>
           <w:rtl w:val="0"/>
         </w:rPr>
-        <w:t xml:space="preserve"> — Full Stack Developer</w:t>
+        <w:t xml:space="preserve"> — Full Stack Developer (Remote)</w:t>
       </w:r>
       <w:r>
         <w:rPr>
@@ -580,7 +580,7 @@
           <w:color w:val="1a1a1a"/>
           <w:rtl w:val="0"/>
         </w:rPr>
-        <w:t xml:space="preserve"> — Founding Software Engineer </w:t>
+        <w:t xml:space="preserve"> — Founding Software Engineer &amp; Shareholder</w:t>
       </w:r>
       <w:r>
         <w:rPr>
@@ -590,7 +590,7 @@
           <w:szCs w:val="18"/>
           <w:rtl w:val="0"/>
         </w:rPr>
-        <w:t xml:space="preserve"> |  Aug 2024 – Present </w:t>
+        <w:t xml:space="preserve">  |  Aug 2024 – Present</w:t>
       </w:r>
     </w:p>
     <w:p>
@@ -947,7 +947,7 @@
           <w:szCs w:val="20"/>
           <w:rtl w:val="0"/>
         </w:rPr>
-        <w:t xml:space="preserve">— Full Stack Developer (Contract)</w:t>
+        <w:t xml:space="preserve">— Full Stack Developer (Fixed-term contract)</w:t>
       </w:r>
       <w:r>
         <w:rPr>

</xml_diff>